<commit_message>
Correcting redundant statements in the Model Refinement section
</commit_message>
<xml_diff>
--- a/Project/Final/Final_Report_RCW.docx
+++ b/Project/Final/Final_Report_RCW.docx
@@ -1787,25 +1787,7 @@
         <w:rPr>
           <w:rFonts w:ascii="Times New Roman" w:hAnsi="Times New Roman" w:cs="Times New Roman"/>
         </w:rPr>
-        <w:t xml:space="preserve">Table </w:t>
-      </w:r>
-      <w:r>
-        <w:rPr>
-          <w:rFonts w:ascii="Times New Roman" w:hAnsi="Times New Roman" w:cs="Times New Roman"/>
-        </w:rPr>
-        <w:t>2</w:t>
-      </w:r>
-      <w:r>
-        <w:rPr>
-          <w:rFonts w:ascii="Times New Roman" w:hAnsi="Times New Roman" w:cs="Times New Roman"/>
-        </w:rPr>
-        <w:t xml:space="preserve">: </w:t>
-      </w:r>
-      <w:r>
-        <w:rPr>
-          <w:rFonts w:ascii="Times New Roman" w:hAnsi="Times New Roman" w:cs="Times New Roman"/>
-        </w:rPr>
-        <w:t>Batch Size Optimization</w:t>
+        <w:t>Table 2: Batch Size Optimization</w:t>
       </w:r>
     </w:p>
     <w:p>
@@ -2012,31 +1994,19 @@
         <w:rPr>
           <w:rFonts w:ascii="Times New Roman" w:hAnsi="Times New Roman" w:cs="Times New Roman"/>
         </w:rPr>
-        <w:t>samples,</w:t>
-      </w:r>
-      <w:r>
-        <w:rPr>
-          <w:rFonts w:ascii="Times New Roman" w:hAnsi="Times New Roman" w:cs="Times New Roman"/>
-        </w:rPr>
-        <w:t xml:space="preserve"> which </w:t>
-      </w:r>
-      <w:r>
-        <w:rPr>
-          <w:rFonts w:ascii="Times New Roman" w:hAnsi="Times New Roman" w:cs="Times New Roman"/>
-        </w:rPr>
-        <w:t xml:space="preserve">is an additional factor when considering inference time. </w:t>
-      </w:r>
-      <w:r>
-        <w:rPr>
-          <w:rFonts w:ascii="Times New Roman" w:hAnsi="Times New Roman" w:cs="Times New Roman"/>
-        </w:rPr>
-        <w:t>Inference time will also be considered during the evaluation of this hyperparameter</w:t>
-      </w:r>
-      <w:r>
-        <w:rPr>
-          <w:rFonts w:ascii="Times New Roman" w:hAnsi="Times New Roman" w:cs="Times New Roman"/>
-        </w:rPr>
-        <w:t>, as this drives the number of tokens the model must attend back to during inference. In a production application, both inference speed and accuracy are critical</w:t>
+        <w:t>samples</w:t>
+      </w:r>
+      <w:r>
+        <w:rPr>
+          <w:rFonts w:ascii="Times New Roman" w:hAnsi="Times New Roman" w:cs="Times New Roman"/>
+        </w:rPr>
+        <w:t xml:space="preserve">, but all </w:t>
+      </w:r>
+      <w:r>
+        <w:rPr>
+          <w:rFonts w:ascii="Times New Roman" w:hAnsi="Times New Roman" w:cs="Times New Roman"/>
+        </w:rPr>
+        <w:t>comparison will be done on an inference time per sample basis to normalize the value</w:t>
       </w:r>
       <w:r>
         <w:rPr>
@@ -2357,19 +2327,7 @@
               <w:rPr>
                 <w:rFonts w:ascii="Times New Roman" w:hAnsi="Times New Roman" w:cs="Times New Roman"/>
               </w:rPr>
-              <w:t>82.</w:t>
-            </w:r>
-            <w:r>
-              <w:rPr>
-                <w:rFonts w:ascii="Times New Roman" w:hAnsi="Times New Roman" w:cs="Times New Roman"/>
-              </w:rPr>
-              <w:t>98</w:t>
-            </w:r>
-            <w:r>
-              <w:rPr>
-                <w:rFonts w:ascii="Times New Roman" w:hAnsi="Times New Roman" w:cs="Times New Roman"/>
-              </w:rPr>
-              <w:t>%</w:t>
+              <w:t>82.98%</w:t>
             </w:r>
           </w:p>
         </w:tc>
@@ -2389,13 +2347,7 @@
               <w:rPr>
                 <w:rFonts w:ascii="Times New Roman" w:hAnsi="Times New Roman" w:cs="Times New Roman"/>
               </w:rPr>
-              <w:t>84.78</w:t>
-            </w:r>
-            <w:r>
-              <w:rPr>
-                <w:rFonts w:ascii="Times New Roman" w:hAnsi="Times New Roman" w:cs="Times New Roman"/>
-              </w:rPr>
-              <w:t>%</w:t>
+              <w:t>84.78%</w:t>
             </w:r>
           </w:p>
         </w:tc>
@@ -3040,31 +2992,7 @@
         <w:rPr>
           <w:rFonts w:ascii="Times New Roman" w:hAnsi="Times New Roman" w:cs="Times New Roman"/>
         </w:rPr>
-        <w:t xml:space="preserve">Table </w:t>
-      </w:r>
-      <w:r>
-        <w:rPr>
-          <w:rFonts w:ascii="Times New Roman" w:hAnsi="Times New Roman" w:cs="Times New Roman"/>
-        </w:rPr>
-        <w:t>3</w:t>
-      </w:r>
-      <w:r>
-        <w:rPr>
-          <w:rFonts w:ascii="Times New Roman" w:hAnsi="Times New Roman" w:cs="Times New Roman"/>
-        </w:rPr>
-        <w:t xml:space="preserve">: </w:t>
-      </w:r>
-      <w:r>
-        <w:rPr>
-          <w:rFonts w:ascii="Times New Roman" w:hAnsi="Times New Roman" w:cs="Times New Roman"/>
-        </w:rPr>
-        <w:t>Max Input Length</w:t>
-      </w:r>
-      <w:r>
-        <w:rPr>
-          <w:rFonts w:ascii="Times New Roman" w:hAnsi="Times New Roman" w:cs="Times New Roman"/>
-        </w:rPr>
-        <w:t xml:space="preserve"> Optimization</w:t>
+        <w:t>Table 3: Max Input Length Optimization</w:t>
       </w:r>
     </w:p>
     <w:p>
@@ -3571,31 +3499,7 @@
               <w:rPr>
                 <w:rFonts w:ascii="Times New Roman" w:hAnsi="Times New Roman" w:cs="Times New Roman"/>
               </w:rPr>
-              <w:t>8</w:t>
-            </w:r>
-            <w:r>
-              <w:rPr>
-                <w:rFonts w:ascii="Times New Roman" w:hAnsi="Times New Roman" w:cs="Times New Roman"/>
-              </w:rPr>
-              <w:t>2</w:t>
-            </w:r>
-            <w:r>
-              <w:rPr>
-                <w:rFonts w:ascii="Times New Roman" w:hAnsi="Times New Roman" w:cs="Times New Roman"/>
-              </w:rPr>
-              <w:t>.0</w:t>
-            </w:r>
-            <w:r>
-              <w:rPr>
-                <w:rFonts w:ascii="Times New Roman" w:hAnsi="Times New Roman" w:cs="Times New Roman"/>
-              </w:rPr>
-              <w:t>6</w:t>
-            </w:r>
-            <w:r>
-              <w:rPr>
-                <w:rFonts w:ascii="Times New Roman" w:hAnsi="Times New Roman" w:cs="Times New Roman"/>
-              </w:rPr>
-              <w:t>%</w:t>
+              <w:t>82.06%</w:t>
             </w:r>
           </w:p>
         </w:tc>
@@ -3615,19 +3519,7 @@
               <w:rPr>
                 <w:rFonts w:ascii="Times New Roman" w:hAnsi="Times New Roman" w:cs="Times New Roman"/>
               </w:rPr>
-              <w:t>82.</w:t>
-            </w:r>
-            <w:r>
-              <w:rPr>
-                <w:rFonts w:ascii="Times New Roman" w:hAnsi="Times New Roman" w:cs="Times New Roman"/>
-              </w:rPr>
-              <w:t>0</w:t>
-            </w:r>
-            <w:r>
-              <w:rPr>
-                <w:rFonts w:ascii="Times New Roman" w:hAnsi="Times New Roman" w:cs="Times New Roman"/>
-              </w:rPr>
-              <w:t>8%</w:t>
+              <w:t>82.08%</w:t>
             </w:r>
           </w:p>
         </w:tc>
@@ -3647,13 +3539,7 @@
               <w:rPr>
                 <w:rFonts w:ascii="Times New Roman" w:hAnsi="Times New Roman" w:cs="Times New Roman"/>
               </w:rPr>
-              <w:t>82.04</w:t>
-            </w:r>
-            <w:r>
-              <w:rPr>
-                <w:rFonts w:ascii="Times New Roman" w:hAnsi="Times New Roman" w:cs="Times New Roman"/>
-              </w:rPr>
-              <w:t>%</w:t>
+              <w:t>82.04%</w:t>
             </w:r>
           </w:p>
         </w:tc>
@@ -3673,13 +3559,7 @@
               <w:rPr>
                 <w:rFonts w:ascii="Times New Roman" w:hAnsi="Times New Roman" w:cs="Times New Roman"/>
               </w:rPr>
-              <w:t>0.8</w:t>
-            </w:r>
-            <w:r>
-              <w:rPr>
-                <w:rFonts w:ascii="Times New Roman" w:hAnsi="Times New Roman" w:cs="Times New Roman"/>
-              </w:rPr>
-              <w:t>2</w:t>
+              <w:t>0.82</w:t>
             </w:r>
           </w:p>
         </w:tc>
@@ -4005,7 +3885,19 @@
         <w:rPr>
           <w:rFonts w:ascii="Times New Roman" w:hAnsi="Times New Roman" w:cs="Times New Roman"/>
         </w:rPr>
-        <w:t xml:space="preserve">savings. </w:t>
+        <w:t>savings</w:t>
+      </w:r>
+      <w:r>
+        <w:rPr>
+          <w:rFonts w:ascii="Times New Roman" w:hAnsi="Times New Roman" w:cs="Times New Roman"/>
+        </w:rPr>
+        <w:t xml:space="preserve"> and the accuracy difference is marginal</w:t>
+      </w:r>
+      <w:r>
+        <w:rPr>
+          <w:rFonts w:ascii="Times New Roman" w:hAnsi="Times New Roman" w:cs="Times New Roman"/>
+        </w:rPr>
+        <w:t xml:space="preserve">. </w:t>
       </w:r>
       <w:r>
         <w:rPr>
@@ -4208,6 +4100,7 @@
       <w:r>
         <w:rPr>
           <w:rFonts w:ascii="Times New Roman" w:hAnsi="Times New Roman" w:cs="Times New Roman"/>
+          <w:noProof/>
         </w:rPr>
         <w:drawing>
           <wp:inline distT="0" distB="0" distL="0" distR="0" wp14:anchorId="3133955A" wp14:editId="2DD4FB17">
@@ -5161,7 +5054,31 @@
         <w:rPr>
           <w:rFonts w:ascii="Times New Roman" w:hAnsi="Times New Roman" w:cs="Times New Roman"/>
         </w:rPr>
-        <w:t xml:space="preserve">Twitter (currently X) has millions of daily active users, generating terabytes of </w:t>
+        <w:t>Twitter</w:t>
+      </w:r>
+      <w:r>
+        <w:rPr>
+          <w:rFonts w:ascii="Times New Roman" w:hAnsi="Times New Roman" w:cs="Times New Roman"/>
+        </w:rPr>
+        <w:t xml:space="preserve"> </w:t>
+      </w:r>
+      <w:r>
+        <w:rPr>
+          <w:rFonts w:ascii="Times New Roman" w:hAnsi="Times New Roman" w:cs="Times New Roman"/>
+        </w:rPr>
+        <w:t xml:space="preserve">has millions of daily active users, </w:t>
+      </w:r>
+      <w:r>
+        <w:rPr>
+          <w:rFonts w:ascii="Times New Roman" w:hAnsi="Times New Roman" w:cs="Times New Roman"/>
+        </w:rPr>
+        <w:t xml:space="preserve">likely </w:t>
+      </w:r>
+      <w:r>
+        <w:rPr>
+          <w:rFonts w:ascii="Times New Roman" w:hAnsi="Times New Roman" w:cs="Times New Roman"/>
+        </w:rPr>
+        <w:t xml:space="preserve">generating terabytes of </w:t>
       </w:r>
       <w:r>
         <w:rPr>
@@ -6738,6 +6655,7 @@
       <w:r>
         <w:rPr>
           <w:rFonts w:ascii="Times New Roman" w:hAnsi="Times New Roman" w:cs="Times New Roman"/>
+          <w:noProof/>
         </w:rPr>
         <w:drawing>
           <wp:inline distT="0" distB="0" distL="0" distR="0" wp14:anchorId="41F7F5D5" wp14:editId="0A07C76B">
@@ -6820,6 +6738,7 @@
       <w:r>
         <w:rPr>
           <w:rFonts w:ascii="Times New Roman" w:hAnsi="Times New Roman" w:cs="Times New Roman"/>
+          <w:noProof/>
         </w:rPr>
         <w:drawing>
           <wp:inline distT="0" distB="0" distL="0" distR="0" wp14:anchorId="2A691D0A" wp14:editId="4592846B">
@@ -6882,19 +6801,7 @@
         <w:rPr>
           <w:rFonts w:ascii="Times New Roman" w:hAnsi="Times New Roman" w:cs="Times New Roman"/>
         </w:rPr>
-        <w:t xml:space="preserve"> </w:t>
-      </w:r>
-      <w:r>
-        <w:rPr>
-          <w:rFonts w:ascii="Times New Roman" w:hAnsi="Times New Roman" w:cs="Times New Roman"/>
-        </w:rPr>
-        <w:t xml:space="preserve">CM and ROC Curve for </w:t>
-      </w:r>
-      <w:r>
-        <w:rPr>
-          <w:rFonts w:ascii="Times New Roman" w:hAnsi="Times New Roman" w:cs="Times New Roman"/>
-        </w:rPr>
-        <w:t xml:space="preserve">Batch Size </w:t>
+        <w:t xml:space="preserve"> CM and ROC Curve for Batch Size </w:t>
       </w:r>
       <w:r>
         <w:rPr>
@@ -6914,6 +6821,7 @@
       <w:r>
         <w:rPr>
           <w:rFonts w:ascii="Times New Roman" w:hAnsi="Times New Roman" w:cs="Times New Roman"/>
+          <w:noProof/>
         </w:rPr>
         <w:lastRenderedPageBreak/>
         <w:drawing>
@@ -6977,19 +6885,7 @@
         <w:rPr>
           <w:rFonts w:ascii="Times New Roman" w:hAnsi="Times New Roman" w:cs="Times New Roman"/>
         </w:rPr>
-        <w:t>: CM and ROC Curve for Batch Size Testing (</w:t>
-      </w:r>
-      <w:r>
-        <w:rPr>
-          <w:rFonts w:ascii="Times New Roman" w:hAnsi="Times New Roman" w:cs="Times New Roman"/>
-        </w:rPr>
-        <w:t>64</w:t>
-      </w:r>
-      <w:r>
-        <w:rPr>
-          <w:rFonts w:ascii="Times New Roman" w:hAnsi="Times New Roman" w:cs="Times New Roman"/>
-        </w:rPr>
-        <w:t>)</w:t>
+        <w:t>: CM and ROC Curve for Batch Size Testing (64)</w:t>
       </w:r>
     </w:p>
     <w:p>
@@ -7003,6 +6899,7 @@
       <w:r>
         <w:rPr>
           <w:rFonts w:ascii="Times New Roman" w:hAnsi="Times New Roman" w:cs="Times New Roman"/>
+          <w:noProof/>
         </w:rPr>
         <w:drawing>
           <wp:inline distT="0" distB="0" distL="0" distR="0" wp14:anchorId="111B403D" wp14:editId="750E713F">
@@ -7065,31 +6962,7 @@
         <w:rPr>
           <w:rFonts w:ascii="Times New Roman" w:hAnsi="Times New Roman" w:cs="Times New Roman"/>
         </w:rPr>
-        <w:t xml:space="preserve">: CM and ROC Curve for </w:t>
-      </w:r>
-      <w:r>
-        <w:rPr>
-          <w:rFonts w:ascii="Times New Roman" w:hAnsi="Times New Roman" w:cs="Times New Roman"/>
-        </w:rPr>
-        <w:t>Max Input Size</w:t>
-      </w:r>
-      <w:r>
-        <w:rPr>
-          <w:rFonts w:ascii="Times New Roman" w:hAnsi="Times New Roman" w:cs="Times New Roman"/>
-        </w:rPr>
-        <w:t xml:space="preserve"> Testing (</w:t>
-      </w:r>
-      <w:r>
-        <w:rPr>
-          <w:rFonts w:ascii="Times New Roman" w:hAnsi="Times New Roman" w:cs="Times New Roman"/>
-        </w:rPr>
-        <w:t>2048</w:t>
-      </w:r>
-      <w:r>
-        <w:rPr>
-          <w:rFonts w:ascii="Times New Roman" w:hAnsi="Times New Roman" w:cs="Times New Roman"/>
-        </w:rPr>
-        <w:t>)</w:t>
+        <w:t>: CM and ROC Curve for Max Input Size Testing (2048)</w:t>
       </w:r>
     </w:p>
     <w:p>
@@ -7102,6 +6975,7 @@
       <w:r>
         <w:rPr>
           <w:rFonts w:ascii="Times New Roman" w:hAnsi="Times New Roman" w:cs="Times New Roman"/>
+          <w:noProof/>
         </w:rPr>
         <w:lastRenderedPageBreak/>
         <w:drawing>
@@ -7153,31 +7027,7 @@
         <w:rPr>
           <w:rFonts w:ascii="Times New Roman" w:hAnsi="Times New Roman" w:cs="Times New Roman"/>
         </w:rPr>
-        <w:t xml:space="preserve">Image </w:t>
-      </w:r>
-      <w:r>
-        <w:rPr>
-          <w:rFonts w:ascii="Times New Roman" w:hAnsi="Times New Roman" w:cs="Times New Roman"/>
-        </w:rPr>
-        <w:t>6</w:t>
-      </w:r>
-      <w:r>
-        <w:rPr>
-          <w:rFonts w:ascii="Times New Roman" w:hAnsi="Times New Roman" w:cs="Times New Roman"/>
-        </w:rPr>
-        <w:t>: CM and ROC Curve for Max Input Size Testing (</w:t>
-      </w:r>
-      <w:r>
-        <w:rPr>
-          <w:rFonts w:ascii="Times New Roman" w:hAnsi="Times New Roman" w:cs="Times New Roman"/>
-        </w:rPr>
-        <w:t>1024</w:t>
-      </w:r>
-      <w:r>
-        <w:rPr>
-          <w:rFonts w:ascii="Times New Roman" w:hAnsi="Times New Roman" w:cs="Times New Roman"/>
-        </w:rPr>
-        <w:t>)</w:t>
+        <w:t>Image 6: CM and ROC Curve for Max Input Size Testing (1024)</w:t>
       </w:r>
     </w:p>
     <w:p>
@@ -7191,6 +7041,7 @@
       <w:r>
         <w:rPr>
           <w:rFonts w:ascii="Times New Roman" w:hAnsi="Times New Roman" w:cs="Times New Roman"/>
+          <w:noProof/>
         </w:rPr>
         <w:drawing>
           <wp:inline distT="0" distB="0" distL="0" distR="0" wp14:anchorId="4D7D3A15" wp14:editId="0871D19C">
@@ -7241,25 +7092,7 @@
         <w:rPr>
           <w:rFonts w:ascii="Times New Roman" w:hAnsi="Times New Roman" w:cs="Times New Roman"/>
         </w:rPr>
-        <w:t xml:space="preserve">Image 7: </w:t>
-      </w:r>
-      <w:r>
-        <w:rPr>
-          <w:rFonts w:ascii="Times New Roman" w:hAnsi="Times New Roman" w:cs="Times New Roman"/>
-        </w:rPr>
-        <w:t>CM and ROC Curve for Max Input Size Testing (</w:t>
-      </w:r>
-      <w:r>
-        <w:rPr>
-          <w:rFonts w:ascii="Times New Roman" w:hAnsi="Times New Roman" w:cs="Times New Roman"/>
-        </w:rPr>
-        <w:t>512</w:t>
-      </w:r>
-      <w:r>
-        <w:rPr>
-          <w:rFonts w:ascii="Times New Roman" w:hAnsi="Times New Roman" w:cs="Times New Roman"/>
-        </w:rPr>
-        <w:t>)</w:t>
+        <w:t>Image 7: CM and ROC Curve for Max Input Size Testing (512)</w:t>
       </w:r>
     </w:p>
     <w:p>
@@ -7273,6 +7106,7 @@
       <w:r>
         <w:rPr>
           <w:rFonts w:ascii="Times New Roman" w:hAnsi="Times New Roman" w:cs="Times New Roman"/>
+          <w:noProof/>
         </w:rPr>
         <w:lastRenderedPageBreak/>
         <w:drawing>
@@ -7324,31 +7158,7 @@
         <w:rPr>
           <w:rFonts w:ascii="Times New Roman" w:hAnsi="Times New Roman" w:cs="Times New Roman"/>
         </w:rPr>
-        <w:t xml:space="preserve">Image </w:t>
-      </w:r>
-      <w:r>
-        <w:rPr>
-          <w:rFonts w:ascii="Times New Roman" w:hAnsi="Times New Roman" w:cs="Times New Roman"/>
-        </w:rPr>
-        <w:t>8</w:t>
-      </w:r>
-      <w:r>
-        <w:rPr>
-          <w:rFonts w:ascii="Times New Roman" w:hAnsi="Times New Roman" w:cs="Times New Roman"/>
-        </w:rPr>
-        <w:t>: CM and ROC Curve for Max Input Size Testing (</w:t>
-      </w:r>
-      <w:r>
-        <w:rPr>
-          <w:rFonts w:ascii="Times New Roman" w:hAnsi="Times New Roman" w:cs="Times New Roman"/>
-        </w:rPr>
-        <w:t>256</w:t>
-      </w:r>
-      <w:r>
-        <w:rPr>
-          <w:rFonts w:ascii="Times New Roman" w:hAnsi="Times New Roman" w:cs="Times New Roman"/>
-        </w:rPr>
-        <w:t>)</w:t>
+        <w:t>Image 8: CM and ROC Curve for Max Input Size Testing (256)</w:t>
       </w:r>
     </w:p>
     <w:p>
@@ -7362,6 +7172,7 @@
       <w:r>
         <w:rPr>
           <w:rFonts w:ascii="Times New Roman" w:hAnsi="Times New Roman" w:cs="Times New Roman"/>
+          <w:noProof/>
         </w:rPr>
         <w:drawing>
           <wp:inline distT="0" distB="0" distL="0" distR="0" wp14:anchorId="7AB824C9" wp14:editId="3757FFBB">
@@ -7412,19 +7223,7 @@
         <w:rPr>
           <w:rFonts w:ascii="Times New Roman" w:hAnsi="Times New Roman" w:cs="Times New Roman"/>
         </w:rPr>
-        <w:t>Image 8: CM and ROC Curve for Max Input Size Testing (</w:t>
-      </w:r>
-      <w:r>
-        <w:rPr>
-          <w:rFonts w:ascii="Times New Roman" w:hAnsi="Times New Roman" w:cs="Times New Roman"/>
-        </w:rPr>
-        <w:t>128</w:t>
-      </w:r>
-      <w:r>
-        <w:rPr>
-          <w:rFonts w:ascii="Times New Roman" w:hAnsi="Times New Roman" w:cs="Times New Roman"/>
-        </w:rPr>
-        <w:t>)</w:t>
+        <w:t>Image 8: CM and ROC Curve for Max Input Size Testing (128)</w:t>
       </w:r>
     </w:p>
     <w:p>
@@ -7438,6 +7237,7 @@
       <w:r>
         <w:rPr>
           <w:rFonts w:ascii="Times New Roman" w:hAnsi="Times New Roman" w:cs="Times New Roman"/>
+          <w:noProof/>
         </w:rPr>
         <w:lastRenderedPageBreak/>
         <w:drawing>
@@ -7489,43 +7289,7 @@
         <w:rPr>
           <w:rFonts w:ascii="Times New Roman" w:hAnsi="Times New Roman" w:cs="Times New Roman"/>
         </w:rPr>
-        <w:t xml:space="preserve">Image </w:t>
-      </w:r>
-      <w:r>
-        <w:rPr>
-          <w:rFonts w:ascii="Times New Roman" w:hAnsi="Times New Roman" w:cs="Times New Roman"/>
-        </w:rPr>
-        <w:t>9</w:t>
-      </w:r>
-      <w:r>
-        <w:rPr>
-          <w:rFonts w:ascii="Times New Roman" w:hAnsi="Times New Roman" w:cs="Times New Roman"/>
-        </w:rPr>
-        <w:t xml:space="preserve">: CM and ROC Curve for </w:t>
-      </w:r>
-      <w:r>
-        <w:rPr>
-          <w:rFonts w:ascii="Times New Roman" w:hAnsi="Times New Roman" w:cs="Times New Roman"/>
-        </w:rPr>
-        <w:t>Layer Freezing Testing</w:t>
-      </w:r>
-      <w:r>
-        <w:rPr>
-          <w:rFonts w:ascii="Times New Roman" w:hAnsi="Times New Roman" w:cs="Times New Roman"/>
-        </w:rPr>
-        <w:t xml:space="preserve"> (</w:t>
-      </w:r>
-      <w:r>
-        <w:rPr>
-          <w:rFonts w:ascii="Times New Roman" w:hAnsi="Times New Roman" w:cs="Times New Roman"/>
-        </w:rPr>
-        <w:t>Layer 11</w:t>
-      </w:r>
-      <w:r>
-        <w:rPr>
-          <w:rFonts w:ascii="Times New Roman" w:hAnsi="Times New Roman" w:cs="Times New Roman"/>
-        </w:rPr>
-        <w:t>)</w:t>
+        <w:t>Image 9: CM and ROC Curve for Layer Freezing Testing (Layer 11)</w:t>
       </w:r>
     </w:p>
     <w:p>
@@ -7539,6 +7303,7 @@
       <w:r>
         <w:rPr>
           <w:rFonts w:ascii="Times New Roman" w:hAnsi="Times New Roman" w:cs="Times New Roman"/>
+          <w:noProof/>
         </w:rPr>
         <w:drawing>
           <wp:inline distT="0" distB="0" distL="0" distR="0" wp14:anchorId="1F097E92" wp14:editId="02DFCABB">
@@ -7589,43 +7354,7 @@
         <w:rPr>
           <w:rFonts w:ascii="Times New Roman" w:hAnsi="Times New Roman" w:cs="Times New Roman"/>
         </w:rPr>
-        <w:t xml:space="preserve">Image </w:t>
-      </w:r>
-      <w:r>
-        <w:rPr>
-          <w:rFonts w:ascii="Times New Roman" w:hAnsi="Times New Roman" w:cs="Times New Roman"/>
-        </w:rPr>
-        <w:t>10</w:t>
-      </w:r>
-      <w:r>
-        <w:rPr>
-          <w:rFonts w:ascii="Times New Roman" w:hAnsi="Times New Roman" w:cs="Times New Roman"/>
-        </w:rPr>
-        <w:t>: CM and ROC Curve for Layer Freezing Testing (Layer</w:t>
-      </w:r>
-      <w:r>
-        <w:rPr>
-          <w:rFonts w:ascii="Times New Roman" w:hAnsi="Times New Roman" w:cs="Times New Roman"/>
-        </w:rPr>
-        <w:t>s</w:t>
-      </w:r>
-      <w:r>
-        <w:rPr>
-          <w:rFonts w:ascii="Times New Roman" w:hAnsi="Times New Roman" w:cs="Times New Roman"/>
-        </w:rPr>
-        <w:t xml:space="preserve"> </w:t>
-      </w:r>
-      <w:r>
-        <w:rPr>
-          <w:rFonts w:ascii="Times New Roman" w:hAnsi="Times New Roman" w:cs="Times New Roman"/>
-        </w:rPr>
-        <w:t>9, 10, 11</w:t>
-      </w:r>
-      <w:r>
-        <w:rPr>
-          <w:rFonts w:ascii="Times New Roman" w:hAnsi="Times New Roman" w:cs="Times New Roman"/>
-        </w:rPr>
-        <w:t>)</w:t>
+        <w:t>Image 10: CM and ROC Curve for Layer Freezing Testing (Layers 9, 10, 11)</w:t>
       </w:r>
     </w:p>
     <w:p>
@@ -7639,6 +7368,7 @@
       <w:r>
         <w:rPr>
           <w:rFonts w:ascii="Times New Roman" w:hAnsi="Times New Roman" w:cs="Times New Roman"/>
+          <w:noProof/>
         </w:rPr>
         <w:lastRenderedPageBreak/>
         <w:drawing>
@@ -7690,31 +7420,7 @@
         <w:rPr>
           <w:rFonts w:ascii="Times New Roman" w:hAnsi="Times New Roman" w:cs="Times New Roman"/>
         </w:rPr>
-        <w:t xml:space="preserve">Image </w:t>
-      </w:r>
-      <w:r>
-        <w:rPr>
-          <w:rFonts w:ascii="Times New Roman" w:hAnsi="Times New Roman" w:cs="Times New Roman"/>
-        </w:rPr>
-        <w:t>11</w:t>
-      </w:r>
-      <w:r>
-        <w:rPr>
-          <w:rFonts w:ascii="Times New Roman" w:hAnsi="Times New Roman" w:cs="Times New Roman"/>
-        </w:rPr>
-        <w:t xml:space="preserve">: CM and ROC Curve for Layer Freezing Testing (Layers </w:t>
-      </w:r>
-      <w:r>
-        <w:rPr>
-          <w:rFonts w:ascii="Times New Roman" w:hAnsi="Times New Roman" w:cs="Times New Roman"/>
-        </w:rPr>
-        <w:t xml:space="preserve">6, 7, 8, </w:t>
-      </w:r>
-      <w:r>
-        <w:rPr>
-          <w:rFonts w:ascii="Times New Roman" w:hAnsi="Times New Roman" w:cs="Times New Roman"/>
-        </w:rPr>
-        <w:t>9, 10, 11)</w:t>
+        <w:t>Image 11: CM and ROC Curve for Layer Freezing Testing (Layers 6, 7, 8, 9, 10, 11)</w:t>
       </w:r>
     </w:p>
     <w:p>
@@ -8969,6 +8675,7 @@
   <w:style w:type="character" w:default="1" w:styleId="DefaultParagraphFont">
     <w:name w:val="Default Paragraph Font"/>
     <w:uiPriority w:val="1"/>
+    <w:semiHidden/>
     <w:unhideWhenUsed/>
   </w:style>
   <w:style w:type="table" w:default="1" w:styleId="TableNormal">

</xml_diff>